<commit_message>
feat(back, front): add rsa question to entretien
</commit_message>
<xml_diff>
--- a/packages/backend/src/usagers/utils/custom-docs/tests/docx-for-tests/all_keys.docx
+++ b/packages/backend/src/usagers/utils/custom-docs/tests/docx-for-tests/all_keys.docx
@@ -3552,6 +3552,52 @@
                 <w:rFonts w:ascii="Arial" w:hAnsi="Arial" w:cs="Arial"/>
               </w:rPr>
               <w:t>Détail des revenus</w:t>
+            </w:r>
+          </w:p>
+        </w:tc>
+      </w:tr>
+      <w:tr>
+        <w:trPr>
+          <w:tblCellSpacing w:w="15" w:type="dxa"/>
+        </w:trPr>
+        <w:tc>
+          <w:tcPr>
+            <w:tcW w:w="0" w:type="auto"/>
+            <w:vAlign w:val="center"/>
+            <w:hideMark/>
+          </w:tcPr>
+          <w:p>
+            <w:pPr>
+              <w:rPr>
+                <w:rFonts w:ascii="Arial" w:hAnsi="Arial" w:cs="Arial"/>
+              </w:rPr>
+            </w:pPr>
+            <w:r>
+              <w:rPr>
+                <w:rStyle w:val="CodeHTML"/>
+                <w:rFonts w:ascii="Arial" w:eastAsia="Arial" w:hAnsi="Arial" w:cs="Arial"/>
+              </w:rPr>
+              <w:t>{ENTRETIEN_RSA}</w:t>
+            </w:r>
+          </w:p>
+        </w:tc>
+        <w:tc>
+          <w:tcPr>
+            <w:tcW w:w="0" w:type="auto"/>
+            <w:vAlign w:val="center"/>
+            <w:hideMark/>
+          </w:tcPr>
+          <w:p>
+            <w:pPr>
+              <w:rPr>
+                <w:rFonts w:ascii="Arial" w:hAnsi="Arial" w:cs="Arial"/>
+              </w:rPr>
+            </w:pPr>
+            <w:r>
+              <w:rPr>
+                <w:rFonts w:ascii="Arial" w:hAnsi="Arial" w:cs="Arial"/>
+              </w:rPr>
+              <w:t>Bénéficiaire du RSA : Oui / Non</w:t>
             </w:r>
           </w:p>
         </w:tc>

</xml_diff>